<commit_message>
Deepen final submission narrative
</commit_message>
<xml_diff>
--- a/提交材料/00_报名表填写文本.docx
+++ b/提交材料/00_报名表填写文本.docx
@@ -243,7 +243,7 @@
         <w:pStyle w:val="BodyText"/>
       </w:pPr>
       <w:r>
-        <w:t xml:space="preserve">核心定位：围绕赛力斯超级工厂高自动化、高数据密度、高质量追溯的制造场景，构建设备-工艺-质量知识底座，并在此基础上打造可主动发现异常、解释风险、派发任务、跟踪处置和回写知识的数字员工。</w:t>
+        <w:t xml:space="preserve">核心定位：构建一名具备“主动巡检、证据推理、协同处置、复盘学习”能力的质量数字员工，把设备参数波动、工艺窗口偏移和批次质量风险转化为可解释、可派发、可关闭的现场行动。</w:t>
       </w:r>
     </w:p>
     <w:p>
@@ -256,7 +256,7 @@
         <w:pStyle w:val="BodyText"/>
       </w:pPr>
       <w:r>
-        <w:t xml:space="preserve">开题报告part 1：赛力斯超级工厂已具备机器人协同、AIoT检测、全过程质量数据采集和一车一档基础。命题的关键不在于再做一个问答系统，而在于把设备告警、工艺窗口、质量风险、历史案例和人员任务连接成可推理的业务闭环。新能源汽车制造中，拧紧、焊接、涂装、压铸等关键工序的风险往往不是单点异常，而是参数漂移、设备状态、批次范围和历史缺陷共同作用。方案将知识图谱作为质量语义底座，用GraphRAG完成跨设备、跨工序、多证据检索，用数字员工完成主动研判和协同执行，目标是把隐性风险拦截在车辆流入下一工序之前。</w:t>
+        <w:t xml:space="preserve">开题报告part 1：赛力斯超级工厂面向高精度新能源汽车制造，质量风险不只来自最终检验结果，而是隐藏在设备状态、工艺参数、环境条件、零件批次和人员处置之间。公开资料显示，赛力斯已围绕质量自动化管理、全过程质量数据采集、异常定位、控线和一车一档形成基础。参赛方案的关键不是再做一个问答系统，而是把数据采集能力转化为主动管控能力：让数字员工围绕设备、工艺、质量和车辆关系，主动发现风险、判断严重性、组织处置、验证关闭，并把责任、时限、状态和复盘沉淀到协同系统。</w:t>
       </w:r>
     </w:p>
     <w:p>
@@ -269,7 +269,7 @@
         <w:pStyle w:val="BodyText"/>
       </w:pPr>
       <w:r>
-        <w:t xml:space="preserve">开题报告part 2：方案建设“知质·灵巡”数字员工。底层建立设备、工位、工序参数、质量特性、VIN、FMEA、控制计划、维修记录和飞书任务本体；中层以GraphRAG、规则引擎和因果约束实现异常识别、根因推断、影响范围圈定与证据链生成；上层提供可交互工作台和飞书Aily入口，支持异常注入、自然语言追问、多维表格记录、机器人卡片通知和任务关闭回写。首期选择总装拧紧、焊装焊点、涂装烘干、一体化压铸冷却四类高价值工况。业务价值体现在异常定位时间下降、重复问题减少、关键工序追溯覆盖提升和班组协同效率提升。方案采用松耦合接口，可从样例数据平滑扩展到MES、QMS、SCADA、PLC、视觉检测和飞书企业应用。</w:t>
+        <w:t xml:space="preserve">开题报告part 2：方案命名为“知质·灵巡”。底层建设工厂质量知识底座，以本体论统一描述产品、工艺、设备、传感器、参数、报警、缺陷模式、根因、控制计划和处置任务，并接入FMEA、维修记录、质检报告、MES、SCADA、PLC与飞书任务数据，形成设备-过程-质量三类实体互联的知识图谱。中层采用GraphRAG：当拧紧扭矩、焊点电流、涂装温度、压铸模温差等设备报警或参数扰动出现时，系统先在图谱中检索相关工序、设备、参数阈值、历史案例和质量后果，再结合文档知识库生成可验证证据链。上层由Autonomous Agent执行“观察-研判-检索-推理-行动-复盘”循环，自动给出风险等级、疑似根因、隔离范围、复检项目、维修任务和放行条件，并在飞书Aily中生成任务，在多维表格追踪责任人、时限、状态和复盘结论。首期选择总装拧紧、焊装点焊、涂装烘干和压铸冷却四类关键工况，目标是异常定位时间下降40%-60%，重复质量问题下降15%-25%，关键工序追溯覆盖达到100%，并可复制到更多产线。</w:t>
       </w:r>
     </w:p>
     <w:p>

</xml_diff>

<commit_message>
Align final report with prompt requirements
</commit_message>
<xml_diff>
--- a/提交材料/00_报名表填写文本.docx
+++ b/提交材料/00_报名表填写文本.docx
@@ -256,7 +256,7 @@
         <w:pStyle w:val="BodyText"/>
       </w:pPr>
       <w:r>
-        <w:t xml:space="preserve">开题报告part 1：赛力斯超级工厂面向高精度新能源汽车制造，质量风险不只来自最终检验结果，而是隐藏在设备状态、工艺参数、环境条件、零件批次和人员处置之间。公开资料显示，赛力斯已围绕质量自动化管理、全过程质量数据采集、异常定位、控线和一车一档形成基础。参赛方案的关键不是再做一个问答系统，而是把数据采集能力转化为主动管控能力：让数字员工围绕设备、工艺、质量和车辆关系，主动发现风险、判断严重性、组织处置、验证关闭，并把责任、时限、状态和复盘沉淀到协同系统。</w:t>
+        <w:t xml:space="preserve">开题报告part 1：赛力斯超级工厂已迈向高度自动化与智能化，真正的质量风险往往不等到终检才出现，而是提前隐藏在设备状态、工艺窗口、参数漂移、零件批次和人员处置链路中。公开资料显示，赛力斯已具备质量自动化管理、异常定位、控线和一车一档基础。本方案的判断是：不能再做被动问答式知识库，而要把知识图谱、GraphRAG和飞书协同变成一名会主动巡检、解释证据、推动任务、复盘学习的质量数字员工。</w:t>
       </w:r>
     </w:p>
     <w:p>
@@ -269,7 +269,7 @@
         <w:pStyle w:val="BodyText"/>
       </w:pPr>
       <w:r>
-        <w:t xml:space="preserve">开题报告part 2：方案命名为“知质·灵巡”。底层建设工厂质量知识底座，以本体论统一描述产品、工艺、设备、传感器、参数、报警、缺陷模式、根因、控制计划和处置任务，并接入FMEA、维修记录、质检报告、MES、SCADA、PLC与飞书任务数据，形成设备-过程-质量三类实体互联的知识图谱。中层采用GraphRAG：当拧紧扭矩、焊点电流、涂装温度、压铸模温差等设备报警或参数扰动出现时，系统先在图谱中检索相关工序、设备、参数阈值、历史案例和质量后果，再结合文档知识库生成可验证证据链。上层由Autonomous Agent执行“观察-研判-检索-推理-行动-复盘”循环，自动给出风险等级、疑似根因、隔离范围、复检项目、维修任务和放行条件，并在飞书Aily中生成任务，在多维表格追踪责任人、时限、状态和复盘结论。首期选择总装拧紧、焊装点焊、涂装烘干和压铸冷却四类关键工况，目标是异常定位时间下降40%-60%，重复质量问题下降15%-25%，关键工序追溯覆盖达到100%，并可复制到更多产线。</w:t>
+        <w:t xml:space="preserve">开题报告part 2：方案命名为“知质·灵巡”。整体概述上，它是一名设备质量风险主动管控数字员工，目标是把工艺过程、设备报警和参数波动转化为可解释、可派发、可关闭的质量行动。架构上，底层以本体论建设质量知识底座，统一产品、工艺、设备、传感器、参数、报警、缺陷模式、根因、控制计划、VIN和处置任务，并接入MES、QMS、SCADA/PLC、FMEA、维修记录、质检报告和飞书任务数据；中层采用GraphRAG，当拧紧扭矩、焊点电流、涂装温度、压铸模温差等异常出现时，沿知识图谱检索工序、设备、阈值、历史案例和质量后果，生成可验证证据链；上层由Autonomous Agent执行“观察-研判-检索-推理-行动-复盘”循环，自动输出风险等级、影响范围、疑似根因、复检项目、维修动作和放行条件，并通过飞书Aily、多维表格、机器人卡片完成任务流转。创新点在于从被动问答升级为主动巡检，从单点报警升级为一车一因果链，从一次性分析升级为风险线程闭环。首期落地总装拧紧、焊装点焊、涂装烘干和压铸冷却四类工况，目标是异常定位时间下降40%-60%，P1任务派发小于1分钟，关键工序追溯覆盖100%，重复质量问题下降15%-25%，并可复制到更多产线。</w:t>
       </w:r>
     </w:p>
     <w:p>

</xml_diff>

<commit_message>
Build final-round quality command center
</commit_message>
<xml_diff>
--- a/提交材料/00_报名表填写文本.docx
+++ b/提交材料/00_报名表填写文本.docx
@@ -191,7 +191,7 @@
       <w:r>
         <w:rPr>
           <w:b/>
-          <w:color w:val="1F4D78"/>
+          <w:color w:val="9E1B32"/>
         </w:rPr>
         <w:t xml:space="preserve">企业命题：</w:t>
       </w:r>
@@ -208,7 +208,7 @@
       <w:r>
         <w:rPr>
           <w:b/>
-          <w:color w:val="1F4D78"/>
+          <w:color w:val="9E1B32"/>
         </w:rPr>
         <w:t xml:space="preserve">队伍名称：</w:t>
       </w:r>
@@ -225,7 +225,7 @@
       <w:r>
         <w:rPr>
           <w:b/>
-          <w:color w:val="1F4D78"/>
+          <w:color w:val="9E1B32"/>
         </w:rPr>
         <w:t xml:space="preserve">作品名称：</w:t>
       </w:r>
@@ -240,10 +240,38 @@
     </w:p>
     <w:p>
       <w:pPr>
+        <w:pStyle w:val="Heading1"/>
+        <w:keepNext/>
+      </w:pPr>
+      <w:r>
+        <w:t xml:space="preserve">开题报告part 1：命题前置分析与洞察</w:t>
+      </w:r>
+    </w:p>
+    <w:p>
+      <w:r>
+        <w:t xml:space="preserve"/>
+      </w:r>
+    </w:p>
+    <w:p>
+      <w:pPr>
         <w:pStyle w:val="BodyText"/>
       </w:pPr>
       <w:r>
-        <w:t xml:space="preserve">核心定位：构建一名具备“主动巡检、证据推理、协同处置、复盘学习”能力的质量数字员工，把设备参数波动、工艺窗口偏移和批次质量风险转化为可解释、可派发、可关闭的现场行动。</w:t>
+        <w:t xml:space="preserve">赛力斯超级工厂已形成“产业大脑+超级工厂”、全过程在线检测和“一件一档、一车一档”等数智基础。真正需要补强的不是再建一个报警看板，而是把设备退化、参数漂移、质量检测、VIN/批次、维修记录和FMEA组织成可行动的风险线程。传统知识库等待人员提问，报警系统只说明“发生了什么”，群聊又难以沉淀责任、时限和证据。因此，本方案将数字员工定义为质量风险专员：异常尚未形成终检缺陷时主动发现，沿图谱圈定影响对象，输出可证伪根因假设与证据链，推动处置并在关闭后形成可复用知识。</w:t>
+      </w:r>
+    </w:p>
+    <w:p>
+      <w:r>
+        <w:t xml:space="preserve"/>
+      </w:r>
+    </w:p>
+    <w:p>
+      <w:pPr>
+        <w:pStyle w:val="Heading1"/>
+        <w:keepNext/>
+      </w:pPr>
+      <w:r>
+        <w:t xml:space="preserve">开题报告part 2：整体解决方案设计</w:t>
       </w:r>
     </w:p>
     <w:p>
@@ -256,20 +284,7 @@
         <w:pStyle w:val="BodyText"/>
       </w:pPr>
       <w:r>
-        <w:t xml:space="preserve">开题报告part 1：赛力斯超级工厂已迈向高度自动化与智能化，真正的质量风险往往不等到终检才出现，而是提前隐藏在设备状态、工艺窗口、参数漂移、零件批次和人员处置链路中。公开资料显示，赛力斯已具备质量自动化管理、异常定位、控线和一车一档基础。本方案的判断是：不能再做被动问答式知识库，而要把知识图谱、GraphRAG和飞书协同变成一名会主动巡检、解释证据、推动任务、复盘学习的质量数字员工。</w:t>
-      </w:r>
-    </w:p>
-    <w:p>
-      <w:r>
-        <w:t xml:space="preserve"/>
-      </w:r>
-    </w:p>
-    <w:p>
-      <w:pPr>
-        <w:pStyle w:val="BodyText"/>
-      </w:pPr>
-      <w:r>
-        <w:t xml:space="preserve">开题报告part 2：方案命名为“知质·灵巡”。整体概述上，它是一名设备质量风险主动管控数字员工，目标是把工艺过程、设备报警和参数波动转化为可解释、可派发、可关闭的质量行动。架构上，底层以本体论建设质量知识底座，统一产品、工艺、设备、传感器、参数、报警、缺陷模式、根因、控制计划、VIN和处置任务，并接入MES、QMS、SCADA/PLC、FMEA、维修记录、质检报告和飞书任务数据；中层采用GraphRAG，当拧紧扭矩、焊点电流、涂装温度、压铸模温差等异常出现时，沿知识图谱检索工序、设备、阈值、历史案例和质量后果，生成可验证证据链；上层由Autonomous Agent执行“观察-研判-检索-推理-行动-复盘”循环，自动输出风险等级、影响范围、疑似根因、复检项目、维修动作和放行条件，并通过飞书Aily、多维表格、机器人卡片完成任务流转。创新点在于从被动问答升级为主动巡检，从单点报警升级为一车一因果链，从一次性分析升级为风险线程闭环。首期落地总装拧紧、焊装点焊、涂装烘干和压铸冷却四类工况，目标是异常定位时间下降40%-60%，P1任务派发小于1分钟，关键工序追溯覆盖100%，重复质量问题下降15%-25%，并可复制到更多产线。</w:t>
+        <w:t xml:space="preserve">“知质·灵巡”由质量知识底座、GraphRAG推理引擎、岗位化Agent和飞书执行织网组成。底座以本体统一设备、工位、工序、参数、质量特性、缺陷模式、VIN/批次、FMEA、控制计划和责任任务；异常触发后，系统先用规则与时序特征分级，再沿图谱检索SOP、维修记录和历史8D，形成风险等级、影响范围、根因Top-K、证据链与关闭条件。Agent执行“观察—研判—检索—推理—行动—复盘”，但不直接修改PLC参数、不替代质量放行、不自动关闭P1。飞书侧以同一事件ID贯穿多维表格、任务、消息卡片和复盘文档，并通过幂等键防止重复派单。作品已完成四类工况互动工作台、13字段在线质量事件表、真实飞书任务和关联复盘文档。90天试点目标为异常定位时间下降40%—60%、P1派单小于1分钟、根因Top-3命中不低于80%、复盘沉淀率不低于90%，并可复制到电驱、电池包、整车标定和供应链质量场景。</w:t>
       </w:r>
     </w:p>
     <w:p>
@@ -281,12 +296,25 @@
       <w:r>
         <w:rPr>
           <w:b/>
-          <w:color w:val="1F4D78"/>
+          <w:color w:val="9E1B32"/>
         </w:rPr>
         <w:t xml:space="preserve">团队补充材料链接：</w:t>
       </w:r>
       <w:r>
         <w:t xml:space="preserve">https://github.com/zhijinDeng/Seris</w:t>
+      </w:r>
+    </w:p>
+    <w:p>
+      <w:r>
+        <w:t xml:space="preserve"/>
+      </w:r>
+    </w:p>
+    <w:p>
+      <w:pPr>
+        <w:pStyle w:val="BodyText"/>
+      </w:pPr>
+      <w:r>
+        <w:t xml:space="preserve">在线质量事件表：https://larkcommunity.feishu.cn/base/DYAabhZeiagT0ZsjGaTcWFPrn7b?table=tblFo5Btaj0IBXiD</w:t>
       </w:r>
     </w:p>
     <w:sectPr>
@@ -360,7 +388,7 @@
       <w:b/>
       <w:sz w:val="36"/>
       <w:szCs w:val="36"/>
-      <w:color w:val="0B2545"/>
+      <w:color w:val="171C22"/>
     </w:rPr>
   </w:style>
   <w:style w:type="paragraph" w:styleId="Subtitle">
@@ -386,7 +414,7 @@
       <w:b/>
       <w:sz w:val="32"/>
       <w:szCs w:val="32"/>
-      <w:color w:val="2E74B5"/>
+      <w:color w:val="9E1B32"/>
     </w:rPr>
   </w:style>
   <w:style w:type="paragraph" w:styleId="Heading2">
@@ -400,7 +428,7 @@
       <w:b/>
       <w:sz w:val="26"/>
       <w:szCs w:val="26"/>
-      <w:color w:val="2E74B5"/>
+      <w:color w:val="34424F"/>
     </w:rPr>
   </w:style>
   <w:style w:type="paragraph" w:styleId="BodyText">

</xml_diff>

<commit_message>
Deepen proactive quality risk assurance
</commit_message>
<xml_diff>
--- a/提交材料/00_报名表填写文本.docx
+++ b/提交材料/00_报名表填写文本.docx
@@ -284,7 +284,7 @@
         <w:pStyle w:val="BodyText"/>
       </w:pPr>
       <w:r>
-        <w:t xml:space="preserve">“知质·灵巡”由质量知识底座、GraphRAG推理引擎、岗位化Agent和飞书执行织网组成。底座以本体统一设备、工位、工序、参数、质量特性、缺陷模式、VIN/批次、FMEA、控制计划和责任任务；异常触发后，系统先用规则与时序特征分级，再沿图谱检索SOP、维修记录和历史8D，形成风险等级、影响范围、根因Top-K、证据链与关闭条件。Agent执行“观察—研判—检索—推理—行动—复盘”，但不直接修改PLC参数、不替代质量放行、不自动关闭P1。飞书侧以同一事件ID贯穿多维表格、任务、消息卡片和复盘文档，并通过幂等键防止重复派单。作品已完成四类工况互动工作台、13字段在线质量事件表、真实飞书任务和关联复盘文档。90天试点目标为异常定位时间下降40%—60%、P1派单小于1分钟、根因Top-3命中不低于80%、复盘沉淀率不低于90%，并可复制到电驱、电池包、整车标定和供应链质量场景。</w:t>
+        <w:t xml:space="preserve">“知质·灵巡”由质量知识底座、主动检测栈、GraphRAG推理引擎、岗位化Agent和飞书执行织网组成。底座以本体统一设备、工位、工序、参数、质量特性、缺陷模式、VIN/批次、FMEA、控制计划和责任任务；系统以数据质量门、工艺规则、EWMA/CUSUM/响应残差和图谱关系形成多引擎共识，计算相对下游检验的缺陷显性化前置量，再沿图谱生成根因Top-3、支持与冲突证据、反证动作和影响对象。Agent执行“观察—研判—检索—推理—行动—复盘”，五项因果护栏限制伪相关，五项确定性关闭门保证P1不被自动放行。飞书侧以同一事件ID贯穿多维表格、任务、消息卡片和复盘文档。作品已完成四类工况互动工作台、13字段在线质量事件表、真实飞书任务和关联复盘文档。90天试点目标为缺陷显性化前置量中位数不少于10分钟、异常定位时间下降40%—60%、P1派单小于1分钟、根因Top-3命中不低于80%、关闭门完整率100%，并可复制到电驱、电池包、整车标定和供应链质量场景。</w:t>
       </w:r>
     </w:p>
     <w:p>
@@ -446,6 +446,20 @@
       <w:spacing w:after="120" w:line="280" w:lineRule="auto"/>
     </w:pPr>
   </w:style>
+  <w:style w:type="paragraph" w:styleId="ReferenceList">
+    <w:name w:val="Reference List"/>
+    <w:basedOn w:val="Normal"/>
+    <w:pPr>
+      <w:ind w:left="360" w:hanging="240"/>
+      <w:spacing w:after="50" w:line="220" w:lineRule="auto"/>
+    </w:pPr>
+    <w:rPr>
+      <w:rFonts w:ascii="Calibri" w:eastAsia="Microsoft YaHei" w:hAnsi="Calibri"/>
+      <w:sz w:val="18"/>
+      <w:szCs w:val="18"/>
+      <w:color w:val="172033"/>
+    </w:rPr>
+  </w:style>
   <w:style w:type="paragraph" w:styleId="SmallSpace">
     <w:name w:val="Small Space"/>
     <w:pPr>

</xml_diff>

<commit_message>
Build production-grade quality decision assurance
</commit_message>
<xml_diff>
--- a/提交材料/00_报名表填写文本.docx
+++ b/提交材料/00_报名表填写文本.docx
@@ -1,6 +1,6 @@
 
 <file path=word/document.xml><?xml version="1.0" encoding="utf-8"?>
-<w:document xmlns:w="http://schemas.openxmlformats.org/wordprocessingml/2006/main">
+<w:document xmlns:w="http://schemas.openxmlformats.org/wordprocessingml/2006/main" xmlns:r="http://schemas.openxmlformats.org/officeDocument/2006/relationships" xmlns:wp="http://schemas.openxmlformats.org/drawingml/2006/wordprocessingDrawing" xmlns:a="http://schemas.openxmlformats.org/drawingml/2006/main" xmlns:pic="http://schemas.openxmlformats.org/drawingml/2006/picture">
   <w:body>
     <w:p>
       <w:pPr>
@@ -284,7 +284,7 @@
         <w:pStyle w:val="BodyText"/>
       </w:pPr>
       <w:r>
-        <w:t xml:space="preserve">“知质·灵巡”由质量知识底座、主动检测栈、GraphRAG推理引擎、岗位化Agent和飞书执行织网组成。底座以本体统一设备、工位、工序、参数、质量特性、缺陷模式、VIN/批次、FMEA、控制计划和责任任务；系统以数据质量门、工艺规则、EWMA/CUSUM/响应残差和图谱关系形成多引擎共识，计算相对下游检验的缺陷显性化前置量，再沿图谱生成根因Top-3、支持与冲突证据、反证动作和影响对象。Agent执行“观察—研判—检索—推理—行动—复盘”，五项因果护栏限制伪相关，五项确定性关闭门保证P1不被自动放行。飞书侧以同一事件ID贯穿多维表格、任务、消息卡片和复盘文档。作品已完成四类工况互动工作台、13字段在线质量事件表、真实飞书任务和关联复盘文档。90天试点目标为缺陷显性化前置量中位数不少于10分钟、异常定位时间下降40%—60%、P1派单小于1分钟、根因Top-3命中不低于80%、关闭门完整率100%，并可复制到电驱、电池包、整车标定和供应链质量场景。</w:t>
+        <w:t xml:space="preserve">“知质·灵巡”由质量知识底座、主动检测栈、GraphRAG推理引擎、岗位化Agent和飞书执行织网组成。底座以本体统一设备、工位、工序、参数、质量特性、VIN/批次、PFMEA、控制计划、证据和责任任务；系统从带时间戳的序列真实计算EWMA/CUSUM触发点和缺陷显性化前置量，再沿图谱生成根因Top-3、支持与冲突证据、反事实动作和影响对象。干预结果会增强、削弱或重排假设，缺少物理证据时不能关闭。数字员工执行“观察—研判—检索—推理—行动—复盘”，质量工程师、检测人员和质量负责人分别承担风险受理、复检签署和最终放行。飞书以同一事件ID贯穿多维表格、任务、消息卡片和复盘文档。作品已完成四工况互动工作台、在线质量事件记录、真实飞书任务和关联复盘文档，并支持影子验证、协同执行、故障降级和事件护照。90天试点以P1召回率不低于95%、前置量中位数不少于10分钟、Top-3命中不低于80%、已关闭P1五项门完整率100%验收，并可复制到电驱、电池包、整车标定和供应链质量场景。</w:t>
       </w:r>
     </w:p>
     <w:p>

</xml_diff>

<commit_message>
Ground final solution in enterprise equipment data
</commit_message>
<xml_diff>
--- a/提交材料/00_报名表填写文本.docx
+++ b/提交材料/00_报名表填写文本.docx
@@ -257,7 +257,7 @@
         <w:pStyle w:val="BodyText"/>
       </w:pPr>
       <w:r>
-        <w:t xml:space="preserve">赛力斯超级工厂已形成“产业大脑+超级工厂”、全过程在线检测和“一件一档、一车一档”等数智基础。真正需要补强的不是再建一个报警看板，而是把设备退化、参数漂移、质量检测、VIN/批次、维修记录和FMEA组织成可行动的风险线程。传统知识库等待人员提问，报警系统只说明“发生了什么”，群聊又难以沉淀责任、时限和证据。因此，本方案将数字员工定义为质量风险专员：异常尚未形成终检缺陷时主动发现，沿图谱圈定影响对象，输出可证伪根因假设与证据链，推动处置并在关闭后形成可复用知识。</w:t>
+        <w:t xml:space="preserve">赛力斯已具备设备标准模型、实例台账、运行采集、维修工单、故障模式、点检保养及“一件一档、一车一档”等数智基础。新提供的脱敏数据进一步表明，现场难点不只在异常发现，也在知识闭环：406张工单中94.33%已关联设备，但故障模式关联率仅17.49%，类型一致的完整结构链仅15.27%；某设备121张工单中119张已关闭，却有120张未形成确认原因、0张关联故障模式。由此，本方案把数字员工定位为设备质量风险专员：既在缺陷显性化前捕捉参数与设备弱信号，也主动审计“工单已关、知识未闭”的风险，组织可验证证据、责任任务、复机确认和标准回写。</w:t>
       </w:r>
     </w:p>
     <w:p>
@@ -284,7 +284,7 @@
         <w:pStyle w:val="BodyText"/>
       </w:pPr>
       <w:r>
-        <w:t xml:space="preserve">“知质·灵巡”由质量知识底座、主动检测栈、GraphRAG推理引擎、岗位化Agent和飞书执行织网组成。底座以本体统一设备、工位、工序、参数、质量特性、VIN/批次、PFMEA、控制计划、证据和责任任务；系统从带时间戳的序列真实计算EWMA/CUSUM触发点和缺陷显性化前置量，再沿图谱生成根因Top-3、支持与冲突证据、反事实动作和影响对象。干预结果会增强、削弱或重排假设，缺少物理证据时不能关闭。数字员工执行“观察—研判—检索—推理—行动—复盘”，质量工程师、检测人员和质量负责人分别承担风险受理、复检签署和最终放行。飞书以同一事件ID贯穿多维表格、任务、消息卡片和复盘文档。作品已完成四工况互动工作台、在线质量事件记录、真实飞书任务和关联复盘文档，并支持影子验证、协同执行、故障降级和事件护照。90天试点以P1召回率不低于95%、前置量中位数不少于10分钟、Top-3命中不低于80%、已关闭P1五项门完整率100%验收，并可复制到电驱、电池包、整车标定和供应链质量场景。</w:t>
+        <w:t xml:space="preserve">“知质·灵巡”采用“一套知识底座、两类主动触发、一条受控闭环”。底座以设备类型—实例—功能—工单—故障模式为主链，并连接工位、参数、质量特性、VIN/批次、PFMEA、控制计划和责任角色。第一类触发来自实时参数与告警：数据质量门、工艺规则、EWMA/CUSUM和响应残差识别弱信号，GraphRAG沿关系子图形成Top-3候选、支持/冲突证据、影响范围和反证动作。第二类触发来自工单知识债：系统按重复频次、原因/措施缺失和故障模式断链主动发现“闭而未解”，借助同类型设备与功能证据提出待验证候选。Agent执行“观察—研判—检索—推理—行动—复盘”，但不直接写PLC、不自动确认根因或质量放行。现有设备平台保持主数据权；飞书Aily、多维表格、任务、卡片和审批承载诊断、检查、复机、标准变更及回写回执。作品已形成企业脱敏数据审计与四类工艺仿真的互动工作台、36节点32关系的机制图谱、可执行审计脚本和飞书在线对象证据。90天试点分别验收实时风险的召回、前置量、影响范围与五门关闭，以及知识债识别复核率、错误自动写入为0和回写可追溯率100%，再按本体模块与流程模板复制到更多产线。</w:t>
       </w:r>
     </w:p>
     <w:p>

</xml_diff>